<commit_message>
docs: agregar logo e historial al ERS
</commit_message>
<xml_diff>
--- a/docs/ERS_ACIS.docx
+++ b/docs/ERS_ACIS.docx
@@ -6,8 +6,42 @@
     <w:p/>
     <w:p/>
     <w:p>
+      <w:pPr>
+        <w:spacing w:after="200"/>
+      </w:pPr>
       <w:r>
-        <w:t>DUOC UC</w:t>
+        <w:drawing>
+          <wp:inline xmlns:a="http://schemas.openxmlformats.org/drawingml/2006/main" xmlns:pic="http://schemas.openxmlformats.org/drawingml/2006/picture">
+            <wp:extent cx="3708000" cy="984938"/>
+            <wp:docPr id="1" name="Picture 1"/>
+            <wp:cNvGraphicFramePr>
+              <a:graphicFrameLocks noChangeAspect="1"/>
+            </wp:cNvGraphicFramePr>
+            <a:graphic>
+              <a:graphicData uri="http://schemas.openxmlformats.org/drawingml/2006/picture">
+                <pic:pic>
+                  <pic:nvPicPr>
+                    <pic:cNvPr id="0" name="logo-duoc-portada.png"/>
+                    <pic:cNvPicPr/>
+                  </pic:nvPicPr>
+                  <pic:blipFill>
+                    <a:blip r:embed="rId11"/>
+                    <a:stretch>
+                      <a:fillRect/>
+                    </a:stretch>
+                  </pic:blipFill>
+                  <pic:spPr>
+                    <a:xfrm>
+                      <a:off x="0" y="0"/>
+                      <a:ext cx="3708000" cy="984938"/>
+                    </a:xfrm>
+                    <a:prstGeom prst="rect"/>
+                  </pic:spPr>
+                </pic:pic>
+              </a:graphicData>
+            </a:graphic>
+          </wp:inline>
+        </w:drawing>
       </w:r>
     </w:p>
     <w:p>
@@ -95,6 +129,7 @@
       <w:tr>
         <w:trPr>
           <w:cantSplit/>
+          <w:tblHeader/>
         </w:trPr>
         <w:tc>
           <w:tcPr>
@@ -201,14 +236,8 @@
             <w:vAlign w:val="center"/>
           </w:tcPr>
           <w:p>
-            <w:pPr>
-              <w:spacing w:after="40" w:before="40"/>
-            </w:pPr>
             <w:r>
-              <w:rPr>
-                <w:sz w:val="17"/>
-              </w:rPr>
-              <w:t>1.0 · 26 de octubre de 2026</w:t>
+              <w:t>1.1 · 26 de octubre de 2026</w:t>
             </w:r>
           </w:p>
         </w:tc>
@@ -334,9 +363,1190 @@
     <w:p/>
     <w:p>
       <w:r>
-        <w:t>Esta ERS describe el producto esperado y el alcance real del prototipo. La marca “Implementado” indica una función disponible en el mismo dispositivo; “Parcial” señala que falta una condición del caso; “Pendiente” identifica trabajo futuro. La revisión docente puede modificar prioridades y reglas aún no definidas.</w:t>
+        <w:t>Esta versión de la ERS describe el producto esperado y el alcance real del prototipo. La marca “Implementado” indica una función disponible en el mismo dispositivo; “Parcial” señala que falta una condición del caso; “Pendiente” identifica trabajo futuro. La revisión docente puede modificar prioridades y reglas aún no definidas.</w:t>
       </w:r>
     </w:p>
+    <w:p>
+      <w:pPr>
+        <w:pStyle w:val="Heading1"/>
+      </w:pPr>
+      <w:r>
+        <w:t>Historial de versiones del proyecto</w:t>
+      </w:r>
+    </w:p>
+    <w:p>
+      <w:r>
+        <w:t>Estas versiones resumen el avance observado en Git. Son etapas de este informe, no etiquetas publicadas en el repositorio. Las ramas de función se conservaron después de integrarse en main.</w:t>
+      </w:r>
+    </w:p>
+    <w:tbl>
+      <w:tblPr>
+        <w:tblStyle w:val="TableGrid"/>
+        <w:tblW w:type="auto" w:w="0"/>
+        <w:jc w:val="center"/>
+        <w:tblLayout w:type="fixed"/>
+        <w:tblLook w:firstColumn="1" w:firstRow="1" w:lastColumn="0" w:lastRow="0" w:noHBand="0" w:noVBand="1" w:val="04A0"/>
+      </w:tblPr>
+      <w:tblGrid>
+        <w:gridCol w:w="1858"/>
+        <w:gridCol w:w="1858"/>
+        <w:gridCol w:w="1858"/>
+        <w:gridCol w:w="1858"/>
+        <w:gridCol w:w="1858"/>
+      </w:tblGrid>
+      <w:tr>
+        <w:trPr>
+          <w:cantSplit/>
+          <w:tblHeader/>
+          <w:tblHeader/>
+        </w:trPr>
+        <w:tc>
+          <w:tcPr>
+            <w:tcW w:type="dxa" w:w="709"/>
+            <w:vAlign w:val="center"/>
+            <w:shd w:fill="DDE9EC"/>
+          </w:tcPr>
+          <w:p>
+            <w:pPr>
+              <w:spacing w:after="20" w:before="20"/>
+            </w:pPr>
+            <w:r>
+              <w:rPr>
+                <w:rFonts w:ascii="Arial" w:hAnsi="Arial"/>
+                <w:b/>
+                <w:sz w:val="15"/>
+              </w:rPr>
+              <w:t>Etapa</w:t>
+            </w:r>
+          </w:p>
+        </w:tc>
+        <w:tc>
+          <w:tcPr>
+            <w:tcW w:type="dxa" w:w="1020"/>
+            <w:vAlign w:val="center"/>
+            <w:shd w:fill="DDE9EC"/>
+          </w:tcPr>
+          <w:p>
+            <w:pPr>
+              <w:spacing w:after="20" w:before="20"/>
+            </w:pPr>
+            <w:r>
+              <w:rPr>
+                <w:rFonts w:ascii="Arial" w:hAnsi="Arial"/>
+                <w:b/>
+                <w:sz w:val="15"/>
+              </w:rPr>
+              <w:t>Fecha 2026</w:t>
+            </w:r>
+          </w:p>
+        </w:tc>
+        <w:tc>
+          <w:tcPr>
+            <w:tcW w:type="dxa" w:w="2409"/>
+            <w:vAlign w:val="center"/>
+            <w:shd w:fill="DDE9EC"/>
+          </w:tcPr>
+          <w:p>
+            <w:pPr>
+              <w:spacing w:after="20" w:before="20"/>
+            </w:pPr>
+            <w:r>
+              <w:rPr>
+                <w:rFonts w:ascii="Arial" w:hAnsi="Arial"/>
+                <w:b/>
+                <w:sz w:val="15"/>
+              </w:rPr>
+              <w:t>Rama</w:t>
+            </w:r>
+          </w:p>
+        </w:tc>
+        <w:tc>
+          <w:tcPr>
+            <w:tcW w:type="dxa" w:w="3883"/>
+            <w:vAlign w:val="center"/>
+            <w:shd w:fill="DDE9EC"/>
+          </w:tcPr>
+          <w:p>
+            <w:pPr>
+              <w:spacing w:after="20" w:before="20"/>
+            </w:pPr>
+            <w:r>
+              <w:rPr>
+                <w:rFonts w:ascii="Arial" w:hAnsi="Arial"/>
+                <w:b/>
+                <w:sz w:val="15"/>
+              </w:rPr>
+              <w:t>Evolución</w:t>
+            </w:r>
+          </w:p>
+        </w:tc>
+        <w:tc>
+          <w:tcPr>
+            <w:tcW w:type="dxa" w:w="1276"/>
+            <w:vAlign w:val="center"/>
+            <w:shd w:fill="DDE9EC"/>
+          </w:tcPr>
+          <w:p>
+            <w:pPr>
+              <w:spacing w:after="20" w:before="20"/>
+            </w:pPr>
+            <w:r>
+              <w:rPr>
+                <w:rFonts w:ascii="Arial" w:hAnsi="Arial"/>
+                <w:b/>
+                <w:sz w:val="15"/>
+              </w:rPr>
+              <w:t>Commits</w:t>
+            </w:r>
+          </w:p>
+        </w:tc>
+      </w:tr>
+      <w:tr>
+        <w:trPr>
+          <w:cantSplit/>
+        </w:trPr>
+        <w:tc>
+          <w:tcPr>
+            <w:tcW w:type="dxa" w:w="709"/>
+            <w:vAlign w:val="center"/>
+          </w:tcPr>
+          <w:p>
+            <w:pPr>
+              <w:spacing w:after="20" w:before="20"/>
+            </w:pPr>
+            <w:r>
+              <w:rPr>
+                <w:rFonts w:ascii="Arial" w:hAnsi="Arial"/>
+                <w:sz w:val="15"/>
+              </w:rPr>
+              <w:t>0.1</w:t>
+            </w:r>
+          </w:p>
+        </w:tc>
+        <w:tc>
+          <w:tcPr>
+            <w:tcW w:type="dxa" w:w="1020"/>
+            <w:vAlign w:val="center"/>
+          </w:tcPr>
+          <w:p>
+            <w:pPr>
+              <w:spacing w:after="20" w:before="20"/>
+            </w:pPr>
+            <w:r>
+              <w:rPr>
+                <w:rFonts w:ascii="Arial" w:hAnsi="Arial"/>
+                <w:sz w:val="15"/>
+              </w:rPr>
+              <w:t>07 oct.</w:t>
+            </w:r>
+          </w:p>
+        </w:tc>
+        <w:tc>
+          <w:tcPr>
+            <w:tcW w:type="dxa" w:w="2409"/>
+            <w:vAlign w:val="center"/>
+          </w:tcPr>
+          <w:p>
+            <w:pPr>
+              <w:spacing w:after="20" w:before="20"/>
+            </w:pPr>
+            <w:r>
+              <w:rPr>
+                <w:rFonts w:ascii="Arial" w:hAnsi="Arial"/>
+                <w:sz w:val="15"/>
+              </w:rPr>
+              <w:t>main</w:t>
+            </w:r>
+          </w:p>
+        </w:tc>
+        <w:tc>
+          <w:tcPr>
+            <w:tcW w:type="dxa" w:w="3883"/>
+            <w:vAlign w:val="center"/>
+          </w:tcPr>
+          <w:p>
+            <w:pPr>
+              <w:spacing w:after="20" w:before="20"/>
+            </w:pPr>
+            <w:r>
+              <w:rPr>
+                <w:rFonts w:ascii="Arial" w:hAnsi="Arial"/>
+                <w:sz w:val="15"/>
+              </w:rPr>
+              <w:t>Base Android y comienzo de órdenes ACIS.</w:t>
+            </w:r>
+          </w:p>
+        </w:tc>
+        <w:tc>
+          <w:tcPr>
+            <w:tcW w:type="dxa" w:w="1276"/>
+            <w:vAlign w:val="center"/>
+          </w:tcPr>
+          <w:p>
+            <w:pPr>
+              <w:spacing w:after="20" w:before="20"/>
+            </w:pPr>
+            <w:r>
+              <w:rPr>
+                <w:rFonts w:ascii="Arial" w:hAnsi="Arial"/>
+                <w:sz w:val="15"/>
+              </w:rPr>
+              <w:t>dd2c405</w:t>
+            </w:r>
+          </w:p>
+        </w:tc>
+      </w:tr>
+      <w:tr>
+        <w:trPr>
+          <w:cantSplit/>
+        </w:trPr>
+        <w:tc>
+          <w:tcPr>
+            <w:tcW w:type="dxa" w:w="709"/>
+            <w:vAlign w:val="center"/>
+          </w:tcPr>
+          <w:p>
+            <w:pPr>
+              <w:spacing w:after="20" w:before="20"/>
+            </w:pPr>
+            <w:r>
+              <w:rPr>
+                <w:rFonts w:ascii="Arial" w:hAnsi="Arial"/>
+                <w:sz w:val="15"/>
+              </w:rPr>
+              <w:t>0.2</w:t>
+            </w:r>
+          </w:p>
+        </w:tc>
+        <w:tc>
+          <w:tcPr>
+            <w:tcW w:type="dxa" w:w="1020"/>
+            <w:vAlign w:val="center"/>
+          </w:tcPr>
+          <w:p>
+            <w:pPr>
+              <w:spacing w:after="20" w:before="20"/>
+            </w:pPr>
+            <w:r>
+              <w:rPr>
+                <w:rFonts w:ascii="Arial" w:hAnsi="Arial"/>
+                <w:sz w:val="15"/>
+              </w:rPr>
+              <w:t>14 oct.</w:t>
+            </w:r>
+          </w:p>
+        </w:tc>
+        <w:tc>
+          <w:tcPr>
+            <w:tcW w:type="dxa" w:w="2409"/>
+            <w:vAlign w:val="center"/>
+          </w:tcPr>
+          <w:p>
+            <w:pPr>
+              <w:spacing w:after="20" w:before="20"/>
+            </w:pPr>
+            <w:r>
+              <w:rPr>
+                <w:rFonts w:ascii="Arial" w:hAnsi="Arial"/>
+                <w:sz w:val="15"/>
+              </w:rPr>
+              <w:t>main</w:t>
+            </w:r>
+          </w:p>
+        </w:tc>
+        <w:tc>
+          <w:tcPr>
+            <w:tcW w:type="dxa" w:w="3883"/>
+            <w:vAlign w:val="center"/>
+          </w:tcPr>
+          <w:p>
+            <w:pPr>
+              <w:spacing w:after="20" w:before="20"/>
+            </w:pPr>
+            <w:r>
+              <w:rPr>
+                <w:rFonts w:ascii="Arial" w:hAnsi="Arial"/>
+                <w:sz w:val="15"/>
+              </w:rPr>
+              <w:t>Planilla Scrum, backlog y flujo de OT ajustados.</w:t>
+            </w:r>
+          </w:p>
+        </w:tc>
+        <w:tc>
+          <w:tcPr>
+            <w:tcW w:type="dxa" w:w="1276"/>
+            <w:vAlign w:val="center"/>
+          </w:tcPr>
+          <w:p>
+            <w:pPr>
+              <w:spacing w:after="20" w:before="20"/>
+            </w:pPr>
+            <w:r>
+              <w:rPr>
+                <w:rFonts w:ascii="Arial" w:hAnsi="Arial"/>
+                <w:sz w:val="15"/>
+              </w:rPr>
+              <w:t>0320aee / e97755d</w:t>
+            </w:r>
+          </w:p>
+        </w:tc>
+      </w:tr>
+      <w:tr>
+        <w:trPr>
+          <w:cantSplit/>
+        </w:trPr>
+        <w:tc>
+          <w:tcPr>
+            <w:tcW w:type="dxa" w:w="709"/>
+            <w:vAlign w:val="center"/>
+          </w:tcPr>
+          <w:p>
+            <w:pPr>
+              <w:spacing w:after="20" w:before="20"/>
+            </w:pPr>
+            <w:r>
+              <w:rPr>
+                <w:rFonts w:ascii="Arial" w:hAnsi="Arial"/>
+                <w:sz w:val="15"/>
+              </w:rPr>
+              <w:t>0.3</w:t>
+            </w:r>
+          </w:p>
+        </w:tc>
+        <w:tc>
+          <w:tcPr>
+            <w:tcW w:type="dxa" w:w="1020"/>
+            <w:vAlign w:val="center"/>
+          </w:tcPr>
+          <w:p>
+            <w:pPr>
+              <w:spacing w:after="20" w:before="20"/>
+            </w:pPr>
+            <w:r>
+              <w:rPr>
+                <w:rFonts w:ascii="Arial" w:hAnsi="Arial"/>
+                <w:sz w:val="15"/>
+              </w:rPr>
+              <w:t>14–21 oct.</w:t>
+            </w:r>
+          </w:p>
+        </w:tc>
+        <w:tc>
+          <w:tcPr>
+            <w:tcW w:type="dxa" w:w="2409"/>
+            <w:vAlign w:val="center"/>
+          </w:tcPr>
+          <w:p>
+            <w:pPr>
+              <w:spacing w:after="20" w:before="20"/>
+            </w:pPr>
+            <w:r>
+              <w:rPr>
+                <w:rFonts w:ascii="Arial" w:hAnsi="Arial"/>
+                <w:sz w:val="15"/>
+              </w:rPr>
+              <w:t>Primer-recorrido</w:t>
+            </w:r>
+          </w:p>
+        </w:tc>
+        <w:tc>
+          <w:tcPr>
+            <w:tcW w:type="dxa" w:w="3883"/>
+            <w:vAlign w:val="center"/>
+          </w:tcPr>
+          <w:p>
+            <w:pPr>
+              <w:spacing w:after="20" w:before="20"/>
+            </w:pPr>
+            <w:r>
+              <w:rPr>
+                <w:rFonts w:ascii="Arial" w:hAnsi="Arial"/>
+                <w:sz w:val="15"/>
+              </w:rPr>
+              <w:t>Primer ciclo local de OT y selección cómoda de fecha y hora.</w:t>
+            </w:r>
+          </w:p>
+        </w:tc>
+        <w:tc>
+          <w:tcPr>
+            <w:tcW w:type="dxa" w:w="1276"/>
+            <w:vAlign w:val="center"/>
+          </w:tcPr>
+          <w:p>
+            <w:pPr>
+              <w:spacing w:after="20" w:before="20"/>
+            </w:pPr>
+            <w:r>
+              <w:rPr>
+                <w:rFonts w:ascii="Arial" w:hAnsi="Arial"/>
+                <w:sz w:val="15"/>
+              </w:rPr>
+              <w:t>b3edaca / 48bb4f5</w:t>
+            </w:r>
+          </w:p>
+        </w:tc>
+      </w:tr>
+      <w:tr>
+        <w:trPr>
+          <w:cantSplit/>
+        </w:trPr>
+        <w:tc>
+          <w:tcPr>
+            <w:tcW w:type="dxa" w:w="709"/>
+            <w:vAlign w:val="center"/>
+          </w:tcPr>
+          <w:p>
+            <w:pPr>
+              <w:spacing w:after="20" w:before="20"/>
+            </w:pPr>
+            <w:r>
+              <w:rPr>
+                <w:rFonts w:ascii="Arial" w:hAnsi="Arial"/>
+                <w:sz w:val="15"/>
+              </w:rPr>
+              <w:t>0.4</w:t>
+            </w:r>
+          </w:p>
+        </w:tc>
+        <w:tc>
+          <w:tcPr>
+            <w:tcW w:type="dxa" w:w="1020"/>
+            <w:vAlign w:val="center"/>
+          </w:tcPr>
+          <w:p>
+            <w:pPr>
+              <w:spacing w:after="20" w:before="20"/>
+            </w:pPr>
+            <w:r>
+              <w:rPr>
+                <w:rFonts w:ascii="Arial" w:hAnsi="Arial"/>
+                <w:sz w:val="15"/>
+              </w:rPr>
+              <w:t>22 oct.</w:t>
+            </w:r>
+          </w:p>
+        </w:tc>
+        <w:tc>
+          <w:tcPr>
+            <w:tcW w:type="dxa" w:w="2409"/>
+            <w:vAlign w:val="center"/>
+          </w:tcPr>
+          <w:p>
+            <w:pPr>
+              <w:spacing w:after="20" w:before="20"/>
+            </w:pPr>
+            <w:r>
+              <w:rPr>
+                <w:rFonts w:ascii="Arial" w:hAnsi="Arial"/>
+                <w:sz w:val="15"/>
+              </w:rPr>
+              <w:t>main</w:t>
+            </w:r>
+          </w:p>
+        </w:tc>
+        <w:tc>
+          <w:tcPr>
+            <w:tcW w:type="dxa" w:w="3883"/>
+            <w:vAlign w:val="center"/>
+          </w:tcPr>
+          <w:p>
+            <w:pPr>
+              <w:spacing w:after="20" w:before="20"/>
+            </w:pPr>
+            <w:r>
+              <w:rPr>
+                <w:rFonts w:ascii="Arial" w:hAnsi="Arial"/>
+                <w:sz w:val="15"/>
+              </w:rPr>
+              <w:t>Navegación, animaciones, tipo y prioridad de OT; mejoras de color.</w:t>
+            </w:r>
+          </w:p>
+        </w:tc>
+        <w:tc>
+          <w:tcPr>
+            <w:tcW w:type="dxa" w:w="1276"/>
+            <w:vAlign w:val="center"/>
+          </w:tcPr>
+          <w:p>
+            <w:pPr>
+              <w:spacing w:after="20" w:before="20"/>
+            </w:pPr>
+            <w:r>
+              <w:rPr>
+                <w:rFonts w:ascii="Arial" w:hAnsi="Arial"/>
+                <w:sz w:val="15"/>
+              </w:rPr>
+              <w:t>caa49d8 / cacf4bb</w:t>
+            </w:r>
+          </w:p>
+        </w:tc>
+      </w:tr>
+      <w:tr>
+        <w:trPr>
+          <w:cantSplit/>
+        </w:trPr>
+        <w:tc>
+          <w:tcPr>
+            <w:tcW w:type="dxa" w:w="709"/>
+            <w:vAlign w:val="center"/>
+          </w:tcPr>
+          <w:p>
+            <w:pPr>
+              <w:spacing w:after="20" w:before="20"/>
+            </w:pPr>
+            <w:r>
+              <w:rPr>
+                <w:rFonts w:ascii="Arial" w:hAnsi="Arial"/>
+                <w:sz w:val="15"/>
+              </w:rPr>
+              <w:t>0.5</w:t>
+            </w:r>
+          </w:p>
+        </w:tc>
+        <w:tc>
+          <w:tcPr>
+            <w:tcW w:type="dxa" w:w="1020"/>
+            <w:vAlign w:val="center"/>
+          </w:tcPr>
+          <w:p>
+            <w:pPr>
+              <w:spacing w:after="20" w:before="20"/>
+            </w:pPr>
+            <w:r>
+              <w:rPr>
+                <w:rFonts w:ascii="Arial" w:hAnsi="Arial"/>
+                <w:sz w:val="15"/>
+              </w:rPr>
+              <w:t>25 oct.</w:t>
+            </w:r>
+          </w:p>
+        </w:tc>
+        <w:tc>
+          <w:tcPr>
+            <w:tcW w:type="dxa" w:w="2409"/>
+            <w:vAlign w:val="center"/>
+          </w:tcPr>
+          <w:p>
+            <w:pPr>
+              <w:spacing w:after="20" w:before="20"/>
+            </w:pPr>
+            <w:r>
+              <w:rPr>
+                <w:rFonts w:ascii="Arial" w:hAnsi="Arial"/>
+                <w:sz w:val="15"/>
+              </w:rPr>
+              <w:t>feature/mvvm-validaciones</w:t>
+            </w:r>
+          </w:p>
+        </w:tc>
+        <w:tc>
+          <w:tcPr>
+            <w:tcW w:type="dxa" w:w="3883"/>
+            <w:vAlign w:val="center"/>
+          </w:tcPr>
+          <w:p>
+            <w:pPr>
+              <w:spacing w:after="20" w:before="20"/>
+            </w:pPr>
+            <w:r>
+              <w:rPr>
+                <w:rFonts w:ascii="Arial" w:hAnsi="Arial"/>
+                <w:sz w:val="15"/>
+              </w:rPr>
+              <w:t>Estado en ViewModel, validaciones separadas, errores por campo y teclado.</w:t>
+            </w:r>
+          </w:p>
+        </w:tc>
+        <w:tc>
+          <w:tcPr>
+            <w:tcW w:type="dxa" w:w="1276"/>
+            <w:vAlign w:val="center"/>
+          </w:tcPr>
+          <w:p>
+            <w:pPr>
+              <w:spacing w:after="20" w:before="20"/>
+            </w:pPr>
+            <w:r>
+              <w:rPr>
+                <w:rFonts w:ascii="Arial" w:hAnsi="Arial"/>
+                <w:sz w:val="15"/>
+              </w:rPr>
+              <w:t>5e5c066 / 696c0f8</w:t>
+            </w:r>
+          </w:p>
+        </w:tc>
+      </w:tr>
+      <w:tr>
+        <w:trPr>
+          <w:cantSplit/>
+        </w:trPr>
+        <w:tc>
+          <w:tcPr>
+            <w:tcW w:type="dxa" w:w="709"/>
+            <w:vAlign w:val="center"/>
+          </w:tcPr>
+          <w:p>
+            <w:pPr>
+              <w:spacing w:after="20" w:before="20"/>
+            </w:pPr>
+            <w:r>
+              <w:rPr>
+                <w:rFonts w:ascii="Arial" w:hAnsi="Arial"/>
+                <w:sz w:val="15"/>
+              </w:rPr>
+              <w:t>0.6</w:t>
+            </w:r>
+          </w:p>
+        </w:tc>
+        <w:tc>
+          <w:tcPr>
+            <w:tcW w:type="dxa" w:w="1020"/>
+            <w:vAlign w:val="center"/>
+          </w:tcPr>
+          <w:p>
+            <w:pPr>
+              <w:spacing w:after="20" w:before="20"/>
+            </w:pPr>
+            <w:r>
+              <w:rPr>
+                <w:rFonts w:ascii="Arial" w:hAnsi="Arial"/>
+                <w:sz w:val="15"/>
+              </w:rPr>
+              <w:t>25 oct.</w:t>
+            </w:r>
+          </w:p>
+        </w:tc>
+        <w:tc>
+          <w:tcPr>
+            <w:tcW w:type="dxa" w:w="2409"/>
+            <w:vAlign w:val="center"/>
+          </w:tcPr>
+          <w:p>
+            <w:pPr>
+              <w:spacing w:after="20" w:before="20"/>
+            </w:pPr>
+            <w:r>
+              <w:rPr>
+                <w:rFonts w:ascii="Arial" w:hAnsi="Arial"/>
+                <w:sz w:val="15"/>
+              </w:rPr>
+              <w:t>feature/persistencia-local</w:t>
+            </w:r>
+          </w:p>
+        </w:tc>
+        <w:tc>
+          <w:tcPr>
+            <w:tcW w:type="dxa" w:w="3883"/>
+            <w:vAlign w:val="center"/>
+          </w:tcPr>
+          <w:p>
+            <w:pPr>
+              <w:spacing w:after="20" w:before="20"/>
+            </w:pPr>
+            <w:r>
+              <w:rPr>
+                <w:rFonts w:ascii="Arial" w:hAnsi="Arial"/>
+                <w:sz w:val="15"/>
+              </w:rPr>
+              <w:t>OT guardadas en base local y actualización individual.</w:t>
+            </w:r>
+          </w:p>
+        </w:tc>
+        <w:tc>
+          <w:tcPr>
+            <w:tcW w:type="dxa" w:w="1276"/>
+            <w:vAlign w:val="center"/>
+          </w:tcPr>
+          <w:p>
+            <w:pPr>
+              <w:spacing w:after="20" w:before="20"/>
+            </w:pPr>
+            <w:r>
+              <w:rPr>
+                <w:rFonts w:ascii="Arial" w:hAnsi="Arial"/>
+                <w:sz w:val="15"/>
+              </w:rPr>
+              <w:t>a91ac62 / 402656f</w:t>
+            </w:r>
+          </w:p>
+        </w:tc>
+      </w:tr>
+      <w:tr>
+        <w:trPr>
+          <w:cantSplit/>
+        </w:trPr>
+        <w:tc>
+          <w:tcPr>
+            <w:tcW w:type="dxa" w:w="709"/>
+            <w:vAlign w:val="center"/>
+          </w:tcPr>
+          <w:p>
+            <w:pPr>
+              <w:spacing w:after="20" w:before="20"/>
+            </w:pPr>
+            <w:r>
+              <w:rPr>
+                <w:rFonts w:ascii="Arial" w:hAnsi="Arial"/>
+                <w:sz w:val="15"/>
+              </w:rPr>
+              <w:t>0.7</w:t>
+            </w:r>
+          </w:p>
+        </w:tc>
+        <w:tc>
+          <w:tcPr>
+            <w:tcW w:type="dxa" w:w="1020"/>
+            <w:vAlign w:val="center"/>
+          </w:tcPr>
+          <w:p>
+            <w:pPr>
+              <w:spacing w:after="20" w:before="20"/>
+            </w:pPr>
+            <w:r>
+              <w:rPr>
+                <w:rFonts w:ascii="Arial" w:hAnsi="Arial"/>
+                <w:sz w:val="15"/>
+              </w:rPr>
+              <w:t>25 oct.</w:t>
+            </w:r>
+          </w:p>
+        </w:tc>
+        <w:tc>
+          <w:tcPr>
+            <w:tcW w:type="dxa" w:w="2409"/>
+            <w:vAlign w:val="center"/>
+          </w:tcPr>
+          <w:p>
+            <w:pPr>
+              <w:spacing w:after="20" w:before="20"/>
+            </w:pPr>
+            <w:r>
+              <w:rPr>
+                <w:rFonts w:ascii="Arial" w:hAnsi="Arial"/>
+                <w:sz w:val="15"/>
+              </w:rPr>
+              <w:t>feature/camara-evidencias</w:t>
+            </w:r>
+          </w:p>
+        </w:tc>
+        <w:tc>
+          <w:tcPr>
+            <w:tcW w:type="dxa" w:w="3883"/>
+            <w:vAlign w:val="center"/>
+          </w:tcPr>
+          <w:p>
+            <w:pPr>
+              <w:spacing w:after="20" w:before="20"/>
+            </w:pPr>
+            <w:r>
+              <w:rPr>
+                <w:rFonts w:ascii="Arial" w:hAnsi="Arial"/>
+                <w:sz w:val="15"/>
+              </w:rPr>
+              <w:t>Fotografía de evidencia asociada a una OT.</w:t>
+            </w:r>
+          </w:p>
+        </w:tc>
+        <w:tc>
+          <w:tcPr>
+            <w:tcW w:type="dxa" w:w="1276"/>
+            <w:vAlign w:val="center"/>
+          </w:tcPr>
+          <w:p>
+            <w:pPr>
+              <w:spacing w:after="20" w:before="20"/>
+            </w:pPr>
+            <w:r>
+              <w:rPr>
+                <w:rFonts w:ascii="Arial" w:hAnsi="Arial"/>
+                <w:sz w:val="15"/>
+              </w:rPr>
+              <w:t>ef1b25c</w:t>
+            </w:r>
+          </w:p>
+        </w:tc>
+      </w:tr>
+      <w:tr>
+        <w:trPr>
+          <w:cantSplit/>
+        </w:trPr>
+        <w:tc>
+          <w:tcPr>
+            <w:tcW w:type="dxa" w:w="709"/>
+            <w:vAlign w:val="center"/>
+          </w:tcPr>
+          <w:p>
+            <w:pPr>
+              <w:spacing w:after="20" w:before="20"/>
+            </w:pPr>
+            <w:r>
+              <w:rPr>
+                <w:rFonts w:ascii="Arial" w:hAnsi="Arial"/>
+                <w:sz w:val="15"/>
+              </w:rPr>
+              <w:t>0.8</w:t>
+            </w:r>
+          </w:p>
+        </w:tc>
+        <w:tc>
+          <w:tcPr>
+            <w:tcW w:type="dxa" w:w="1020"/>
+            <w:vAlign w:val="center"/>
+          </w:tcPr>
+          <w:p>
+            <w:pPr>
+              <w:spacing w:after="20" w:before="20"/>
+            </w:pPr>
+            <w:r>
+              <w:rPr>
+                <w:rFonts w:ascii="Arial" w:hAnsi="Arial"/>
+                <w:sz w:val="15"/>
+              </w:rPr>
+              <w:t>25 oct.</w:t>
+            </w:r>
+          </w:p>
+        </w:tc>
+        <w:tc>
+          <w:tcPr>
+            <w:tcW w:type="dxa" w:w="2409"/>
+            <w:vAlign w:val="center"/>
+          </w:tcPr>
+          <w:p>
+            <w:pPr>
+              <w:spacing w:after="20" w:before="20"/>
+            </w:pPr>
+            <w:r>
+              <w:rPr>
+                <w:rFonts w:ascii="Arial" w:hAnsi="Arial"/>
+                <w:sz w:val="15"/>
+              </w:rPr>
+              <w:t>fix/mayuscula-formularios; fix/orden-listado-ot</w:t>
+            </w:r>
+          </w:p>
+        </w:tc>
+        <w:tc>
+          <w:tcPr>
+            <w:tcW w:type="dxa" w:w="3883"/>
+            <w:vAlign w:val="center"/>
+          </w:tcPr>
+          <w:p>
+            <w:pPr>
+              <w:spacing w:after="20" w:before="20"/>
+            </w:pPr>
+            <w:r>
+              <w:rPr>
+                <w:rFonts w:ascii="Arial" w:hAnsi="Arial"/>
+                <w:sz w:val="15"/>
+              </w:rPr>
+              <w:t>Inicio de oración en mayúscula y OT recientes primero.</w:t>
+            </w:r>
+          </w:p>
+        </w:tc>
+        <w:tc>
+          <w:tcPr>
+            <w:tcW w:type="dxa" w:w="1276"/>
+            <w:vAlign w:val="center"/>
+          </w:tcPr>
+          <w:p>
+            <w:pPr>
+              <w:spacing w:after="20" w:before="20"/>
+            </w:pPr>
+            <w:r>
+              <w:rPr>
+                <w:rFonts w:ascii="Arial" w:hAnsi="Arial"/>
+                <w:sz w:val="15"/>
+              </w:rPr>
+              <w:t>995caa6 / 2d2ae80</w:t>
+            </w:r>
+          </w:p>
+        </w:tc>
+      </w:tr>
+      <w:tr>
+        <w:trPr>
+          <w:cantSplit/>
+        </w:trPr>
+        <w:tc>
+          <w:tcPr>
+            <w:tcW w:type="dxa" w:w="709"/>
+            <w:vAlign w:val="center"/>
+          </w:tcPr>
+          <w:p>
+            <w:pPr>
+              <w:spacing w:after="20" w:before="20"/>
+            </w:pPr>
+            <w:r>
+              <w:rPr>
+                <w:rFonts w:ascii="Arial" w:hAnsi="Arial"/>
+                <w:sz w:val="15"/>
+              </w:rPr>
+              <w:t>0.9</w:t>
+            </w:r>
+          </w:p>
+        </w:tc>
+        <w:tc>
+          <w:tcPr>
+            <w:tcW w:type="dxa" w:w="1020"/>
+            <w:vAlign w:val="center"/>
+          </w:tcPr>
+          <w:p>
+            <w:pPr>
+              <w:spacing w:after="20" w:before="20"/>
+            </w:pPr>
+            <w:r>
+              <w:rPr>
+                <w:rFonts w:ascii="Arial" w:hAnsi="Arial"/>
+                <w:sz w:val="15"/>
+              </w:rPr>
+              <w:t>25 oct.</w:t>
+            </w:r>
+          </w:p>
+        </w:tc>
+        <w:tc>
+          <w:tcPr>
+            <w:tcW w:type="dxa" w:w="2409"/>
+            <w:vAlign w:val="center"/>
+          </w:tcPr>
+          <w:p>
+            <w:pPr>
+              <w:spacing w:after="20" w:before="20"/>
+            </w:pPr>
+            <w:r>
+              <w:rPr>
+                <w:rFonts w:ascii="Arial" w:hAnsi="Arial"/>
+                <w:sz w:val="15"/>
+              </w:rPr>
+              <w:t>feature/ubicacion-checkin</w:t>
+            </w:r>
+          </w:p>
+        </w:tc>
+        <w:tc>
+          <w:tcPr>
+            <w:tcW w:type="dxa" w:w="3883"/>
+            <w:vAlign w:val="center"/>
+          </w:tcPr>
+          <w:p>
+            <w:pPr>
+              <w:spacing w:after="20" w:before="20"/>
+            </w:pPr>
+            <w:r>
+              <w:rPr>
+                <w:rFonts w:ascii="Arial" w:hAnsi="Arial"/>
+                <w:sz w:val="15"/>
+              </w:rPr>
+              <w:t>Ubicación aproximada opcional al registrar llegada.</w:t>
+            </w:r>
+          </w:p>
+        </w:tc>
+        <w:tc>
+          <w:tcPr>
+            <w:tcW w:type="dxa" w:w="1276"/>
+            <w:vAlign w:val="center"/>
+          </w:tcPr>
+          <w:p>
+            <w:pPr>
+              <w:spacing w:after="20" w:before="20"/>
+            </w:pPr>
+            <w:r>
+              <w:rPr>
+                <w:rFonts w:ascii="Arial" w:hAnsi="Arial"/>
+                <w:sz w:val="15"/>
+              </w:rPr>
+              <w:t>ca13e41</w:t>
+            </w:r>
+          </w:p>
+        </w:tc>
+      </w:tr>
+      <w:tr>
+        <w:trPr>
+          <w:cantSplit/>
+        </w:trPr>
+        <w:tc>
+          <w:tcPr>
+            <w:tcW w:type="dxa" w:w="709"/>
+            <w:vAlign w:val="center"/>
+          </w:tcPr>
+          <w:p>
+            <w:pPr>
+              <w:spacing w:after="20" w:before="20"/>
+            </w:pPr>
+            <w:r>
+              <w:rPr>
+                <w:rFonts w:ascii="Arial" w:hAnsi="Arial"/>
+                <w:sz w:val="15"/>
+              </w:rPr>
+              <w:t>1.0</w:t>
+            </w:r>
+          </w:p>
+        </w:tc>
+        <w:tc>
+          <w:tcPr>
+            <w:tcW w:type="dxa" w:w="1020"/>
+            <w:vAlign w:val="center"/>
+          </w:tcPr>
+          <w:p>
+            <w:pPr>
+              <w:spacing w:after="20" w:before="20"/>
+            </w:pPr>
+            <w:r>
+              <w:rPr>
+                <w:rFonts w:ascii="Arial" w:hAnsi="Arial"/>
+                <w:sz w:val="15"/>
+              </w:rPr>
+              <w:t>25–26 oct.</w:t>
+            </w:r>
+          </w:p>
+        </w:tc>
+        <w:tc>
+          <w:tcPr>
+            <w:tcW w:type="dxa" w:w="2409"/>
+            <w:vAlign w:val="center"/>
+          </w:tcPr>
+          <w:p>
+            <w:pPr>
+              <w:spacing w:after="20" w:before="20"/>
+            </w:pPr>
+            <w:r>
+              <w:rPr>
+                <w:rFonts w:ascii="Arial" w:hAnsi="Arial"/>
+                <w:sz w:val="15"/>
+              </w:rPr>
+              <w:t>docs/readme-entrega; docs/integrantes-docente; codex/docs-ers-acis</w:t>
+            </w:r>
+          </w:p>
+        </w:tc>
+        <w:tc>
+          <w:tcPr>
+            <w:tcW w:type="dxa" w:w="3883"/>
+            <w:vAlign w:val="center"/>
+          </w:tcPr>
+          <w:p>
+            <w:pPr>
+              <w:spacing w:after="20" w:before="20"/>
+            </w:pPr>
+            <w:r>
+              <w:rPr>
+                <w:rFonts w:ascii="Arial" w:hAnsi="Arial"/>
+                <w:sz w:val="15"/>
+              </w:rPr>
+              <w:t>README de entrega, integrantes, docente y primera ERS.</w:t>
+            </w:r>
+          </w:p>
+        </w:tc>
+        <w:tc>
+          <w:tcPr>
+            <w:tcW w:type="dxa" w:w="1276"/>
+            <w:vAlign w:val="center"/>
+          </w:tcPr>
+          <w:p>
+            <w:pPr>
+              <w:spacing w:after="20" w:before="20"/>
+            </w:pPr>
+            <w:r>
+              <w:rPr>
+                <w:rFonts w:ascii="Arial" w:hAnsi="Arial"/>
+                <w:sz w:val="15"/>
+              </w:rPr>
+              <w:t>7744dfa / 5e6cbbd / 95298fe</w:t>
+            </w:r>
+          </w:p>
+        </w:tc>
+      </w:tr>
+      <w:tr>
+        <w:trPr>
+          <w:cantSplit/>
+        </w:trPr>
+        <w:tc>
+          <w:tcPr>
+            <w:tcW w:type="dxa" w:w="709"/>
+            <w:vAlign w:val="center"/>
+          </w:tcPr>
+          <w:p>
+            <w:pPr>
+              <w:spacing w:after="20" w:before="20"/>
+            </w:pPr>
+            <w:r>
+              <w:rPr>
+                <w:rFonts w:ascii="Arial" w:hAnsi="Arial"/>
+                <w:sz w:val="15"/>
+              </w:rPr>
+              <w:t>1.1</w:t>
+            </w:r>
+          </w:p>
+        </w:tc>
+        <w:tc>
+          <w:tcPr>
+            <w:tcW w:type="dxa" w:w="1020"/>
+            <w:vAlign w:val="center"/>
+          </w:tcPr>
+          <w:p>
+            <w:pPr>
+              <w:spacing w:after="20" w:before="20"/>
+            </w:pPr>
+            <w:r>
+              <w:rPr>
+                <w:rFonts w:ascii="Arial" w:hAnsi="Arial"/>
+                <w:sz w:val="15"/>
+              </w:rPr>
+              <w:t>26 oct.</w:t>
+            </w:r>
+          </w:p>
+        </w:tc>
+        <w:tc>
+          <w:tcPr>
+            <w:tcW w:type="dxa" w:w="2409"/>
+            <w:vAlign w:val="center"/>
+          </w:tcPr>
+          <w:p>
+            <w:pPr>
+              <w:spacing w:after="20" w:before="20"/>
+            </w:pPr>
+            <w:r>
+              <w:rPr>
+                <w:rFonts w:ascii="Arial" w:hAnsi="Arial"/>
+                <w:sz w:val="15"/>
+              </w:rPr>
+              <w:t>codex/docs-ers-historial</w:t>
+            </w:r>
+          </w:p>
+        </w:tc>
+        <w:tc>
+          <w:tcPr>
+            <w:tcW w:type="dxa" w:w="3883"/>
+            <w:vAlign w:val="center"/>
+          </w:tcPr>
+          <w:p>
+            <w:pPr>
+              <w:spacing w:after="20" w:before="20"/>
+            </w:pPr>
+            <w:r>
+              <w:rPr>
+                <w:rFonts w:ascii="Arial" w:hAnsi="Arial"/>
+                <w:sz w:val="15"/>
+              </w:rPr>
+              <w:t>Logo institucional e historial de evolución en esta ERS.</w:t>
+            </w:r>
+          </w:p>
+        </w:tc>
+        <w:tc>
+          <w:tcPr>
+            <w:tcW w:type="dxa" w:w="1276"/>
+            <w:vAlign w:val="center"/>
+          </w:tcPr>
+          <w:p>
+            <w:pPr>
+              <w:spacing w:after="20" w:before="20"/>
+            </w:pPr>
+            <w:r>
+              <w:rPr>
+                <w:rFonts w:ascii="Arial" w:hAnsi="Arial"/>
+                <w:sz w:val="15"/>
+              </w:rPr>
+              <w:t>Revisión actual</w:t>
+            </w:r>
+          </w:p>
+        </w:tc>
+      </w:tr>
+    </w:tbl>
     <w:p>
       <w:pPr>
         <w:pStyle w:val="Heading1"/>
@@ -398,6 +1608,7 @@
       <w:tr>
         <w:trPr>
           <w:cantSplit/>
+          <w:tblHeader/>
         </w:trPr>
         <w:tc>
           <w:tcPr>
@@ -684,7 +1895,7 @@
     </w:p>
     <w:p>
       <w:r>
-        <w:t>Caso_DSY1105 _ACIS.pdf, secciones 2 a 5; Ev. Parcial 2_Estudiante_Encargo_DSY1105.pdf; Temáticas sugeridas o ejemplo Ev. Parcial 2 y 3 _DSY1105_ Anexo Docente.pdf; repositorio Proyecto-ACIS (README, planificación y código Kotlin), revisado el 26 de octubre de 2026. La estructura de esta ERS toma como ejemplo el documento “Anexo 4 - ERS Grano.docx” del equipo.</w:t>
+        <w:t>Caso_DSY1105 _ACIS.pdf, secciones 2 a 5; Ev. Parcial 2_Estudiante_Encargo_DSY1105.pdf; Temáticas sugeridas o ejemplo Ev. Parcial 2 y 3 _DSY1105_ Anexo Docente.pdf; repositorio Proyecto-ACIS (README, planificación y código Kotlin), revisado el 26 de octubre de 2026. La estructura de esta ERS toma como ejemplo el documento “Anexo 4 - ERS Grano.docx” del equipo. Logotipo de Duoc UC tomado del sitio institucional (www.duoc.cl).</w:t>
       </w:r>
     </w:p>
     <w:p>
@@ -724,6 +1935,7 @@
     <w:p>
       <w:pPr>
         <w:pStyle w:val="Heading2"/>
+        <w:pageBreakBefore/>
       </w:pPr>
       <w:r>
         <w:t>2.2. Perfiles de usuario</w:t>
@@ -744,6 +1956,7 @@
       <w:tr>
         <w:trPr>
           <w:cantSplit/>
+          <w:tblHeader/>
         </w:trPr>
         <w:tc>
           <w:tcPr>
@@ -1421,6 +2634,7 @@
     <w:p>
       <w:pPr>
         <w:pStyle w:val="Heading2"/>
+        <w:pageBreakBefore/>
       </w:pPr>
       <w:r>
         <w:t>3.3. Requisitos no funcionales</w:t>
@@ -1442,6 +2656,7 @@
       <w:tr>
         <w:trPr>
           <w:cantSplit/>
+          <w:tblHeader/>
         </w:trPr>
         <w:tc>
           <w:tcPr>
@@ -2203,6 +3418,7 @@
     <w:p>
       <w:pPr>
         <w:pStyle w:val="Heading2"/>
+        <w:pageBreakBefore/>
       </w:pPr>
       <w:r>
         <w:t>4.2. Datos previstos para el sistema completo</w:t>
@@ -2222,6 +3438,7 @@
       <w:tr>
         <w:trPr>
           <w:cantSplit/>
+          <w:tblHeader/>
         </w:trPr>
         <w:tc>
           <w:tcPr>
@@ -2543,6 +3760,7 @@
       <w:tr>
         <w:trPr>
           <w:cantSplit/>
+          <w:tblHeader/>
         </w:trPr>
         <w:tc>
           <w:tcPr>
@@ -2819,11 +4037,6 @@
       </w:tr>
     </w:tbl>
     <w:p/>
-    <w:p>
-      <w:r>
-        <w:t>Este documento puede actualizarse después de la revisión del prototipo y de las indicaciones del docente. Los requisitos pendientes describen el sistema esperado por el caso; no se presentan como funciones terminadas.</w:t>
-      </w:r>
-    </w:p>
     <w:sectPr>
       <w:headerReference w:type="default" r:id="rId9"/>
       <w:footerReference w:type="default" r:id="rId10"/>
@@ -2848,7 +4061,7 @@
         <w:color w:val="64737C"/>
         <w:sz w:val="16"/>
       </w:rPr>
-      <w:t xml:space="preserve">ERS ACIS · Versión 1.0  |  </w:t>
+      <w:t xml:space="preserve">ERS ACIS · Versión 1.1  |  </w:t>
     </w:r>
     <w:fldSimple w:instr="PAGE"/>
   </w:p>

</xml_diff>

<commit_message>
docs: aclarar uso de ramas
</commit_message>
<xml_diff>
--- a/docs/ERS_ACIS.docx
+++ b/docs/ERS_ACIS.docx
@@ -237,7 +237,7 @@
           </w:tcPr>
           <w:p>
             <w:r>
-              <w:t>1.1 · 26 de octubre de 2026</w:t>
+              <w:t>1.2 · 26 de octubre de 2026</w:t>
             </w:r>
           </w:p>
         </w:tc>
@@ -376,7 +376,7 @@
     </w:p>
     <w:p>
       <w:r>
-        <w:t>Estas versiones resumen el avance observado en Git. Son etapas de este informe, no etiquetas publicadas en el repositorio. Las ramas de función se conservaron después de integrarse en main.</w:t>
+        <w:t>Estas versiones resumen el avance observado en Git; no son etiquetas publicadas. Las ramas indican dónde se realizó cada etapa. Las ramas temporales de documentación y correcciones menores se eliminaron después de integrarlas en main; sus commits siguen en el historial.</w:t>
       </w:r>
     </w:p>
     <w:tbl>
@@ -1535,6 +1535,93 @@
           <w:p>
             <w:pPr>
               <w:spacing w:after="20" w:before="20"/>
+            </w:pPr>
+            <w:r>
+              <w:rPr>
+                <w:rFonts w:ascii="Arial" w:hAnsi="Arial"/>
+                <w:sz w:val="15"/>
+              </w:rPr>
+              <w:t>Revisión actual</w:t>
+            </w:r>
+          </w:p>
+        </w:tc>
+      </w:tr>
+      <w:tr>
+        <w:tc>
+          <w:tcPr>
+            <w:tcW w:type="dxa" w:w="709"/>
+          </w:tcPr>
+          <w:p>
+            <w:pPr>
+              <w:spacing w:before="20" w:after="20"/>
+            </w:pPr>
+            <w:r>
+              <w:rPr>
+                <w:rFonts w:ascii="Arial" w:hAnsi="Arial"/>
+                <w:sz w:val="15"/>
+              </w:rPr>
+              <w:t>1.2</w:t>
+            </w:r>
+          </w:p>
+        </w:tc>
+        <w:tc>
+          <w:tcPr>
+            <w:tcW w:type="dxa" w:w="1020"/>
+          </w:tcPr>
+          <w:p>
+            <w:pPr>
+              <w:spacing w:before="20" w:after="20"/>
+            </w:pPr>
+            <w:r>
+              <w:rPr>
+                <w:rFonts w:ascii="Arial" w:hAnsi="Arial"/>
+                <w:sz w:val="15"/>
+              </w:rPr>
+              <w:t>26 oct.</w:t>
+            </w:r>
+          </w:p>
+        </w:tc>
+        <w:tc>
+          <w:tcPr>
+            <w:tcW w:type="dxa" w:w="2409"/>
+          </w:tcPr>
+          <w:p>
+            <w:pPr>
+              <w:spacing w:before="20" w:after="20"/>
+            </w:pPr>
+            <w:r>
+              <w:rPr>
+                <w:rFonts w:ascii="Arial" w:hAnsi="Arial"/>
+                <w:sz w:val="15"/>
+              </w:rPr>
+              <w:t>main</w:t>
+            </w:r>
+          </w:p>
+        </w:tc>
+        <w:tc>
+          <w:tcPr>
+            <w:tcW w:type="dxa" w:w="3883"/>
+          </w:tcPr>
+          <w:p>
+            <w:pPr>
+              <w:spacing w:before="20" w:after="20"/>
+            </w:pPr>
+            <w:r>
+              <w:rPr>
+                <w:rFonts w:ascii="Arial" w:hAnsi="Arial"/>
+                <w:sz w:val="15"/>
+              </w:rPr>
+              <w:t>Simplificación de ramas y actualización de la política de trabajo.</w:t>
+            </w:r>
+          </w:p>
+        </w:tc>
+        <w:tc>
+          <w:tcPr>
+            <w:tcW w:type="dxa" w:w="1276"/>
+          </w:tcPr>
+          <w:p>
+            <w:pPr>
+              <w:spacing w:before="20" w:after="20"/>
             </w:pPr>
             <w:r>
               <w:rPr>
@@ -4061,7 +4148,7 @@
         <w:color w:val="64737C"/>
         <w:sz w:val="16"/>
       </w:rPr>
-      <w:t xml:space="preserve">ERS ACIS · Versión 1.1  |  </w:t>
+      <w:t xml:space="preserve">ERS ACIS · Versión 1.2  |  </w:t>
     </w:r>
     <w:fldSimple w:instr="PAGE"/>
   </w:p>

</xml_diff>